<commit_message>
Corregir terminología: 71 dependencias, no 71 edificios
Algunas dependencias municipales comparten el mismo edificio, así que "71
edificios" sobrestima el parque edilicio real — el número correcto de 71 es
de dependencias. Corregido en el dossier, el piloto EMEAI, el generador del
Word y las notas de análisis. Los demás lugares del proyecto ya usaban
"dependencias" correctamente.

Co-Authored-By: Claude Sonnet 5 <noreply@anthropic.com>
</commit_message>
<xml_diff>
--- a/SIGEP_360_Dossier.docx
+++ b/SIGEP_360_Dossier.docx
@@ -221,7 +221,7 @@
                 <w:sz w:val="20"/>
                 <w:szCs w:val="20"/>
               </w:rPr>
-              <w:t xml:space="preserve">≈ 71 edificios municipales</w:t>
+              <w:t xml:space="preserve">≈ 71 dependencias municipales</w:t>
             </w:r>
           </w:p>
         </w:tc>
@@ -6119,7 +6119,7 @@
         <w:spacing w:after="160" w:before="0"/>
       </w:pPr>
       <w:r>
-        <w:t xml:space="preserve">Antes de que el MVP esté operativo, un relevamiento acotado (fines de 2026 / inicio de 2027) calcula el ISE inicial de los 71 edificios. Es barato —una planilla y una recorrida— y resuelve el problema de fondo: hoy no existe una línea de base contra la cual medir, en 2031, si el sistema efectivamente mejoró algo.</w:t>
+        <w:t xml:space="preserve">Antes de que el MVP esté operativo, un relevamiento acotado (fines de 2026 / inicio de 2027) calcula el ISE inicial de las 71 dependencias. Es barato —una planilla y una recorrida— y resuelve el problema de fondo: hoy no existe una línea de base contra la cual medir, en 2031, si el sistema efectivamente mejoró algo.</w:t>
       </w:r>
     </w:p>
     <w:p>

</xml_diff>

<commit_message>
Quitar menciones al "jurado" del contenido del dossier
El documento no debe especular sobre cómo lo va a leer o evaluar el jurado.
Se retiran las 3 menciones (capítulo 6, mejora k, mejora d), reformulando
sin perder el argumento de fondo de cada una.

Co-Authored-By: Claude Sonnet 5 <noreply@anthropic.com>
</commit_message>
<xml_diff>
--- a/SIGEP_360_Dossier.docx
+++ b/SIGEP_360_Dossier.docx
@@ -4586,7 +4586,7 @@
           <w:iCs/>
           <w:color w:val="6B6B66"/>
         </w:rPr>
-        <w:t xml:space="preserve">SIGEP 360 no es un mecanismo de vigilancia del trabajador, y no puede depender de la buena voluntad de una sola gestión para sobrevivir. Son los puntos que un jurado técnico va a mirar con más atención.</w:t>
+        <w:t xml:space="preserve">SIGEP 360 no es un mecanismo de vigilancia del trabajador, y no puede depender de la buena voluntad de una sola gestión para sobrevivir.</w:t>
       </w:r>
     </w:p>
     <w:p>
@@ -5766,7 +5766,7 @@
         <w:spacing w:after="160" w:before="0"/>
       </w:pPr>
       <w:r>
-        <w:t xml:space="preserve">El propio archivo histórico de Obras Públicas (2013–2023) lo demuestra: sumar el monto de una reparación de 2013 con el de una de 2023 no da una cifra financieramente significativa, por la inflación acumulada en el período. "Costo de mantenimiento por m²" debe expresarse en una unidad de valor real y no en pesos históricos sumados sin ajustar. Es un detalle técnico, pero es el tipo de detalle que un jurado con formación económica nota inmediatamente.</w:t>
+        <w:t xml:space="preserve">El propio archivo histórico de Obras Públicas (2013–2023) lo demuestra: sumar el monto de una reparación de 2013 con el de una de 2023 no da una cifra financieramente significativa, por la inflación acumulada en el período. "Costo de mantenimiento por m²" debe expresarse en una unidad de valor real y no en pesos históricos sumados sin ajustar. Es un detalle técnico, pero evita comparaciones económicas engañosas entre períodos con inflación muy distinta.</w:t>
       </w:r>
     </w:p>
     <w:p>
@@ -5940,7 +5940,7 @@
         <w:spacing w:after="160" w:before="0"/>
       </w:pPr>
       <w:r>
-        <w:t xml:space="preserve">El MVP (Producto Mínimo Viable) 2027 se construye sobre un stack de bajo costo —PWA más base de datos abierta, sin licenciamiento por usuario— precisamente para no atar al Municipio a un proveedor caro desde el día uno. Un jurado evalúa viabilidad económica tanto como idea.</w:t>
+        <w:t xml:space="preserve">El MVP (Producto Mínimo Viable) 2027 se construye sobre un stack de bajo costo —PWA más base de datos abierta, sin licenciamiento por usuario— precisamente para no atar al Municipio a un proveedor caro desde el día uno.</w:t>
       </w:r>
     </w:p>
     <w:p>

</xml_diff>

<commit_message>
Quitar las letras y la etiqueta "Mejora" de los recuadros de mejora, y "no vigilar al trabajador"
Se retira la identificación por letra (a, c, d, e, f, h, k) y el tag "Mejora"
de los 7 recuadros restantes, para que el contenido se lea como parte
integrada del plan y no como una lista de cambios marcados. Se aplicó a
los 7 recuadros existentes (el pedido nombraba a, c, d, f, k; se incluyeron
también e y h por consistencia visual). También se retira "no vigilar al
trabajador" de la sección de personal, capacitación e incentivos.

Co-Authored-By: Claude Sonnet 5 <noreply@anthropic.com>
</commit_message>
<xml_diff>
--- a/SIGEP_360_Dossier.docx
+++ b/SIGEP_360_Dossier.docx
@@ -4538,16 +4538,6 @@
         <w:rPr>
           <w:b/>
           <w:bCs/>
-          <w:color w:val="2a78d6"/>
-          <w:sz w:val="20"/>
-          <w:szCs w:val="20"/>
-        </w:rPr>
-        <w:t xml:space="preserve">MEJORA (e)  </w:t>
-      </w:r>
-      <w:r>
-        <w:rPr>
-          <w:b/>
-          <w:bCs/>
           <w:sz w:val="22"/>
           <w:szCs w:val="22"/>
         </w:rPr>
@@ -4603,7 +4593,7 @@
         <w:spacing w:after="160" w:before="0"/>
       </w:pPr>
       <w:r>
-        <w:t xml:space="preserve">La tecnología debe reducir improvisación y tareas administrativas innecesarias, no vigilar al trabajador. Se propone un Programa de Reconocimiento por Objetivos de Equipo —sujeto a normativa laboral, disponibilidad presupuestaria y autorización competente— que puede considerar plazo, calidad, seguridad, orden, uso responsable de materiales, documentación y ausencia de retrabajos. Los reconocimientos podrán combinar incentivos económicos cuando legalmente sean posibles con capacitación, certificaciones y reconocimiento institucional; el enfoque es colectivo, para evitar competencia improductiva.</w:t>
+        <w:t xml:space="preserve">La tecnología debe reducir improvisación y tareas administrativas innecesarias. Se propone un Programa de Reconocimiento por Objetivos de Equipo —sujeto a normativa laboral, disponibilidad presupuestaria y autorización competente— que puede considerar plazo, calidad, seguridad, orden, uso responsable de materiales, documentación y ausencia de retrabajos. Los reconocimientos podrán combinar incentivos económicos cuando legalmente sean posibles con capacitación, certificaciones y reconocimiento institucional; el enfoque es colectivo, para evitar competencia improductiva.</w:t>
       </w:r>
     </w:p>
     <w:p>
@@ -4627,16 +4617,6 @@
       <w:pPr>
         <w:spacing w:after="40" w:before="160"/>
       </w:pPr>
-      <w:r>
-        <w:rPr>
-          <w:b/>
-          <w:bCs/>
-          <w:color w:val="2a78d6"/>
-          <w:sz w:val="20"/>
-          <w:szCs w:val="20"/>
-        </w:rPr>
-        <w:t xml:space="preserve">MEJORA (a)  </w:t>
-      </w:r>
       <w:r>
         <w:rPr>
           <w:b/>
@@ -5745,16 +5725,6 @@
         <w:rPr>
           <w:b/>
           <w:bCs/>
-          <w:color w:val="2a78d6"/>
-          <w:sz w:val="20"/>
-          <w:szCs w:val="20"/>
-        </w:rPr>
-        <w:t xml:space="preserve">MEJORA (k)  </w:t>
-      </w:r>
-      <w:r>
-        <w:rPr>
-          <w:b/>
-          <w:bCs/>
           <w:sz w:val="22"/>
           <w:szCs w:val="22"/>
         </w:rPr>
@@ -5790,16 +5760,6 @@
       <w:pPr>
         <w:spacing w:after="40" w:before="160"/>
       </w:pPr>
-      <w:r>
-        <w:rPr>
-          <w:b/>
-          <w:bCs/>
-          <w:color w:val="2a78d6"/>
-          <w:sz w:val="20"/>
-          <w:szCs w:val="20"/>
-        </w:rPr>
-        <w:t xml:space="preserve">MEJORA (f)  </w:t>
-      </w:r>
       <w:r>
         <w:rPr>
           <w:b/>
@@ -5826,16 +5786,6 @@
         <w:rPr>
           <w:b/>
           <w:bCs/>
-          <w:color w:val="2a78d6"/>
-          <w:sz w:val="20"/>
-          <w:szCs w:val="20"/>
-        </w:rPr>
-        <w:t xml:space="preserve">MEJORA (h)  </w:t>
-      </w:r>
-      <w:r>
-        <w:rPr>
-          <w:b/>
-          <w:bCs/>
           <w:sz w:val="22"/>
           <w:szCs w:val="22"/>
         </w:rPr>
@@ -5915,16 +5865,6 @@
       <w:pPr>
         <w:spacing w:after="40" w:before="160"/>
       </w:pPr>
-      <w:r>
-        <w:rPr>
-          <w:b/>
-          <w:bCs/>
-          <w:color w:val="2a78d6"/>
-          <w:sz w:val="20"/>
-          <w:szCs w:val="20"/>
-        </w:rPr>
-        <w:t xml:space="preserve">MEJORA (d)  </w:t>
-      </w:r>
       <w:r>
         <w:rPr>
           <w:b/>
@@ -6094,16 +6034,6 @@
       <w:pPr>
         <w:spacing w:after="40" w:before="160"/>
       </w:pPr>
-      <w:r>
-        <w:rPr>
-          <w:b/>
-          <w:bCs/>
-          <w:color w:val="2a78d6"/>
-          <w:sz w:val="20"/>
-          <w:szCs w:val="20"/>
-        </w:rPr>
-        <w:t xml:space="preserve">MEJORA (c)  </w:t>
-      </w:r>
       <w:r>
         <w:rPr>
           <w:b/>

</xml_diff>

<commit_message>
Quitar recuadro de costos por fase y renombrar título a "Producto Mínimo Viable 2027"
Co-Authored-By: Claude Sonnet 5 <noreply@anthropic.com>
</commit_message>
<xml_diff>
--- a/SIGEP_360_Dossier.docx
+++ b/SIGEP_360_Dossier.docx
@@ -5863,33 +5863,11 @@
     </w:p>
     <w:p>
       <w:pPr>
-        <w:spacing w:after="40" w:before="160"/>
-      </w:pPr>
-      <w:r>
-        <w:rPr>
-          <w:b/>
-          <w:bCs/>
-          <w:sz w:val="22"/>
-          <w:szCs w:val="22"/>
-        </w:rPr>
-        <w:t xml:space="preserve">Costos por fase, en orden de magnitud</w:t>
-      </w:r>
-    </w:p>
-    <w:p>
-      <w:pPr>
-        <w:spacing w:after="160" w:before="0"/>
-      </w:pPr>
-      <w:r>
-        <w:t xml:space="preserve">El MVP (Producto Mínimo Viable) 2027 se construye sobre un stack de bajo costo —PWA más base de datos abierta, sin licenciamiento por usuario— precisamente para no atar al Municipio a un proveedor caro desde el día uno.</w:t>
-      </w:r>
-    </w:p>
-    <w:p>
-      <w:pPr>
         <w:pStyle w:val="Heading3"/>
         <w:spacing w:after="100" w:before="220"/>
       </w:pPr>
       <w:r>
-        <w:t xml:space="preserve">MVP 2027</w:t>
+        <w:t xml:space="preserve">Producto Mínimo Viable 2027</w:t>
       </w:r>
     </w:p>
     <w:p>

</xml_diff>

<commit_message>
Cierre de diseño: texto justificado, hyphenation y corrección de typo
- Párrafos del dossier (.prose, .callout, .imp, .vision-box, .proposito)
  pasan a justificado con text-align-last:left (para que la última línea no
  quede estirada) y hyphens:auto (se agrega lang="es" al contenedor
  principal para que el navegador use el diccionario correcto).
- Mismo criterio en el generador de Word: los párrafos de cuerpo quedan
  justificados por defecto.
- Se limpia CSS que ya no se usaba (de las letras y el tag "Mejora").
- Corrige un typo: "próprias" → "propias".

Co-Authored-By: Claude Sonnet 5 <noreply@anthropic.com>
</commit_message>
<xml_diff>
--- a/SIGEP_360_Dossier.docx
+++ b/SIGEP_360_Dossier.docx
@@ -63,6 +63,7 @@
     <w:p>
       <w:pPr>
         <w:spacing w:after="220" w:before="0"/>
+        <w:jc w:val="both"/>
       </w:pPr>
       <w:r>
         <w:t xml:space="preserve">SIGEP 360 es la propuesta de implementación del programa de diagnóstico, prevención de patologías y mantenimiento de los Edificios Públicos solicitado para este concurso: ordena el diagnóstico (ISE, Historia Clínica Edilicia), sistematiza la prevención de patologías (mapa de riesgo, patologías activas, enfoque preventivo/predictivo) y rediseña el mantenimiento (flujo operativo, Orden de Trabajo, materiales, cuadrillas). Plan estratégico de transformación de la Jefatura de Obras Públicas, período 2027–2037.</w:t>
@@ -409,6 +410,7 @@
     <w:p>
       <w:pPr>
         <w:spacing w:after="160" w:before="0"/>
+        <w:jc w:val="both"/>
       </w:pPr>
       <w:r>
         <w:rPr>
@@ -422,6 +424,7 @@
     <w:p>
       <w:pPr>
         <w:spacing w:after="160" w:before="0"/>
+        <w:jc w:val="both"/>
       </w:pPr>
       <w:r>
         <w:t xml:space="preserve">Obras Públicas gestiona el mantenimiento, reparación, mejora y planificación de los edificios y dependencias del Partido de Ayacucho: ≈71 dependencias municipales, un número que debe tratarse como dinámico, no como un padrón cerrado. La Planta Urbana aportada al proyecto se adopta como base cartográfica real para la localización territorial (ver capítulo 5).</w:t>
@@ -430,6 +433,7 @@
     <w:p>
       <w:pPr>
         <w:spacing w:after="160" w:before="0"/>
+        <w:jc w:val="both"/>
       </w:pPr>
       <w:r>
         <w:t xml:space="preserve">La oportunidad de mejora no es necesariamente equipar más, sino programar y medir mejor el uso de los recursos existentes.</w:t>
@@ -438,6 +442,7 @@
     <w:p>
       <w:pPr>
         <w:spacing w:after="160" w:before="0"/>
+        <w:jc w:val="both"/>
       </w:pPr>
       <w:r>
         <w:t xml:space="preserve">Los pedidos de reparación hoy entran por WhatsApp, teléfono, notas, expedientes o en persona. La multiplicidad de canales no es solo el problema: también lo es que no existe una puerta operativa única que consolide el pedido, su prioridad, responsable, materiales, tiempos y cierre. Sin eso, se dificulta construir estadísticas, comparar tiempos de respuesta, reconocer reincidencias y convertir el trabajo realizado en conocimiento institucional.</w:t>
@@ -446,6 +451,7 @@
     <w:p>
       <w:pPr>
         <w:spacing w:after="160" w:before="0"/>
+        <w:jc w:val="both"/>
       </w:pPr>
       <w:r>
         <w:t xml:space="preserve">El circuito de materiales existe, pero su trazabilidad es débil porque distintos usuarios pueden retirar elementos sin un circuito suficientemente controlado — esto afecta la confiabilidad del stock y dificulta preservar materiales de valor (ver BAMUR, capítulo 4).</w:t>
@@ -454,6 +460,7 @@
     <w:p>
       <w:pPr>
         <w:spacing w:after="160" w:before="0"/>
+        <w:jc w:val="both"/>
       </w:pPr>
       <w:r>
         <w:t xml:space="preserve">Los problemas recurrentes son los esperables en un parque edilicio de esta escala sin mantenimiento preventivo sistemático: filtraciones y fallas de cubiertas, revoques en mal estado, problemas eléctricos, problemas en instalaciones sanitarias y mantenimiento general. Estas cinco familias serán los primeros campos de estandarización de SIGEP 360.</w:t>
@@ -462,6 +469,7 @@
     <w:p>
       <w:pPr>
         <w:spacing w:after="160" w:before="0"/>
+        <w:jc w:val="both"/>
       </w:pPr>
       <w:r>
         <w:t xml:space="preserve">Un punto importante a desarrollar en esta Jefatura es la consolidación de una política pública referida a la puesta en valor de Edificios Públicos Municipales que en lo cotidiano no se realiza debido al trajín diario no planificado.</w:t>
@@ -479,6 +487,7 @@
     <w:p>
       <w:pPr>
         <w:spacing w:after="160" w:before="0"/>
+        <w:jc w:val="both"/>
       </w:pPr>
       <w:r>
         <w:t xml:space="preserve">Una intervención arbitraria y no evaluada por el personal competente, vinculada a una ampliación, derivó posteriormente en una solución provisoria e incómoda — se resolvió una necesidad puntual sin pasar por una evaluación técnica integral. No es un caso para personalizar responsabilidades: es el ejemplo exacto de por qué las decisiones edilicias relevantes necesitan evaluación técnica documentada antes de ejecutarse, y no una corrección después. Los responsables políticos, directores y usuarios cambian; el edificio permanece.</w:t>
@@ -1008,6 +1017,7 @@
     <w:p>
       <w:pPr>
         <w:spacing w:after="160" w:before="0"/>
+        <w:jc w:val="both"/>
       </w:pPr>
       <w:r>
         <w:rPr>
@@ -1021,6 +1031,7 @@
     <w:p>
       <w:pPr>
         <w:spacing w:after="160" w:before="0"/>
+        <w:jc w:val="both"/>
       </w:pPr>
       <w:r>
         <w:t xml:space="preserve">La transformación que propone es de modelo: de una gestión predominantemente reactiva a una gestión integral, preventiva, documentada y progresivamente predictiva del patrimonio edilicio municipal. No consiste en crear una estructura paralela ni en informatizar por informatizar: consiste en ordenar lo que ya existe y convertir cada intervención en información útil para la siguiente decisión.</w:t>
@@ -1029,6 +1040,7 @@
     <w:p>
       <w:pPr>
         <w:spacing w:after="160" w:before="0"/>
+        <w:jc w:val="both"/>
       </w:pPr>
       <w:r>
         <w:rPr>
@@ -1582,6 +1594,7 @@
     <w:p>
       <w:pPr>
         <w:spacing w:after="160" w:before="0"/>
+        <w:jc w:val="both"/>
       </w:pPr>
       <w:r>
         <w:rPr>
@@ -2783,6 +2796,7 @@
     <w:p>
       <w:pPr>
         <w:spacing w:after="160" w:before="100"/>
+        <w:jc w:val="both"/>
       </w:pPr>
       <w:r>
         <w:rPr>
@@ -2795,6 +2809,7 @@
     <w:p>
       <w:pPr>
         <w:spacing w:after="160" w:before="0"/>
+        <w:jc w:val="both"/>
       </w:pPr>
       <w:r>
         <w:t xml:space="preserve">La prioridad final combina el ISE con la Criticidad Funcional, el riesgo para las personas, la continuidad del servicio, el costo de no intervenir y la oportunidad de ejecución: dos patologías iguales pueden recibir prioridades distintas según el uso del edificio. Ver un cálculo de ejemplo aplicado a EMEAI, con datos reales, en el capítulo 9.</w:t>
@@ -3311,6 +3326,7 @@
     <w:p>
       <w:pPr>
         <w:spacing w:after="160" w:before="0"/>
+        <w:jc w:val="both"/>
       </w:pPr>
       <w:r>
         <w:t xml:space="preserve">El puntaje es una ayuda a la decisión, no un reemplazo del criterio profesional: una emergencia de seguridad puede escalarse inmediatamente aunque su puntaje ordinario no haya sido completado.</w:t>
@@ -3333,6 +3349,7 @@
     <w:p>
       <w:pPr>
         <w:spacing w:after="160" w:before="0"/>
+        <w:jc w:val="both"/>
       </w:pPr>
       <w:r>
         <w:rPr>
@@ -3355,6 +3372,7 @@
     <w:p>
       <w:pPr>
         <w:spacing w:after="160" w:before="0"/>
+        <w:jc w:val="both"/>
       </w:pPr>
       <w:r>
         <w:rPr>
@@ -3370,6 +3388,7 @@
     <w:p>
       <w:pPr>
         <w:spacing w:after="160" w:before="0"/>
+        <w:jc w:val="both"/>
       </w:pPr>
       <w:r>
         <w:t xml:space="preserve">Cada solicitud incluye edificio, solicitante, fecha, sector, descripción, fotografías y tipo de necesidad. Cada Orden de Trabajo lleva número, edificio, sector, problema, prioridad, fotos, cuadrilla, responsable, materiales, horas, fecha, resultado y observaciones.</w:t>
@@ -3378,6 +3397,7 @@
     <w:p>
       <w:pPr>
         <w:spacing w:after="160" w:before="0"/>
+        <w:jc w:val="both"/>
       </w:pPr>
       <w:r>
         <w:t xml:space="preserve">Al registrarse, el sistema clasifica automáticamente cada solicitud por rubro —albañilería, electricidad, plomería, pintura, y los que se agreguen— y calcula su prioridad en función de urgencia, riesgo, afectación del servicio y antigüedad del reclamo (además de ISE, criticidad funcional y recursos disponibles, ver capítulo 3). Esa prioridad calculada alimenta directamente, sin paso manual intermedio, la agenda de cada cuadrilla y el listado consolidado de materiales que se arma más abajo.</w:t>
@@ -3395,6 +3415,7 @@
     <w:p>
       <w:pPr>
         <w:spacing w:after="160" w:before="0"/>
+        <w:jc w:val="both"/>
       </w:pPr>
       <w:r>
         <w:t xml:space="preserve">Agendas diarias y semanales que resuelven qué hacer, cuándo, quién, dónde y con qué materiales — agrupando tareas por prioridad, cercanía geográfica, rubro, edificio, herramientas y disponibilidad, para reducir viajes y tiempos improductivos. Determinadas intervenciones pueden programarse fuera del horario habitual de funcionamiento del edificio cuando sea técnicamente conveniente. El tablero diferencia, como mínimo, seis estados: Pendiente de evaluación, Pendiente de autorización, Pendiente de materiales, Programada, En ejecución y Finalizada — una tarea no se incorpora al cronograma como "lista para ejecutar" si necesita materiales que aún no están disponibles.</w:t>
@@ -3412,6 +3433,7 @@
     <w:p>
       <w:pPr>
         <w:spacing w:after="160" w:before="0"/>
+        <w:jc w:val="both"/>
       </w:pPr>
       <w:r>
         <w:rPr>
@@ -3427,6 +3449,7 @@
     <w:p>
       <w:pPr>
         <w:spacing w:after="160" w:before="0"/>
+        <w:jc w:val="both"/>
       </w:pPr>
       <w:r>
         <w:t xml:space="preserve">Antes de comprar: primero se verifica si hay material en depósito, después si hay material recuperado técnicamente reutilizable (BAMUR), y recién entonces se compra lo faltante. El depósito digital registra stock, ingresos, egresos, reservas, destino, responsable del retiro, OT asociada y edificio de destino — con identificación por QR o código. Objetivo: que una cuadrilla nunca llegue a una tarea y descubra en obra que le faltan materiales.</w:t>
@@ -3444,6 +3467,7 @@
     <w:p>
       <w:pPr>
         <w:spacing w:after="160" w:before="0"/>
+        <w:jc w:val="both"/>
       </w:pPr>
       <w:r>
         <w:t xml:space="preserve">Los corralones y proveedores habituales del Municipio quedan cargados en una base común, y Obras Públicas compara alternativas antes de autorizar el retiro — no después. Cuando una OT o una tarea programada requiere materiales, el responsable carga las cantidades previstas (por ejemplo: 20 bolsas de cemento, 10 de cal y 2 m³ de arena), y esa necesidad queda asociada al edificio, la intervención, la cuadrilla y la fecha prevista.</w:t>
@@ -3855,6 +3879,7 @@
     <w:p>
       <w:pPr>
         <w:spacing w:after="160" w:before="0"/>
+        <w:jc w:val="both"/>
       </w:pPr>
       <w:r>
         <w:t xml:space="preserve">La vigencia del precio y el retiro de materiales sin un precio estipulado de antemano son los tipos de errores administrativos que SIGEP 360 debe impedir por diseño, no corregir después. Cada movimiento queda relacionado con solicitante, autorización, proveedor, precio, fecha, edificio, OT, persona que retira y destino final — esto permite conocer cuánto material consume cada edificio o tipo de reparación y construir mejores presupuestos futuros.</w:t>
@@ -3863,6 +3888,7 @@
     <w:p>
       <w:pPr>
         <w:spacing w:after="160" w:before="0"/>
+        <w:jc w:val="both"/>
       </w:pPr>
       <w:r>
         <w:t xml:space="preserve">La base de datos cuenta con un listado de precios que cada casa proveedora de materiales inscripta provee —con acceso limitado para actualizar su propio catálogo y precios— para poder hacer comparativas inmediatas, ya con un precio estipulado por los comercios, y generar el presupuesto antes del retiro.</w:t>
@@ -3880,6 +3906,7 @@
     <w:p>
       <w:pPr>
         <w:spacing w:after="160" w:before="0"/>
+        <w:jc w:val="both"/>
       </w:pPr>
       <w:r>
         <w:t xml:space="preserve">Inventario de materiales reutilizables (madera, pisos, puertas, ventanas, chapas, sanitarios, adoquines, mobiliario, elementos históricos), cada uno con código, origen, cantidad, estado, fotos y destino posterior. El caso real: en una intervención sobre el edificio original de la Escuela de Música se recuperó piso de pinotea en buen estado, que fue separado y resguardado para futuras reutilizaciones. Sin un registro como BAMUR, ese material se pierde de la memoria institucional en cuanto termina la obra. Con él, queda disponible para la próxima. Es economía circular aplicada a la gestión municipal — ver el caso documentado en el capítulo 9.</w:t>
@@ -3897,6 +3924,7 @@
     <w:p>
       <w:pPr>
         <w:spacing w:after="160" w:before="0"/>
+        <w:jc w:val="both"/>
       </w:pPr>
       <w:r>
         <w:t xml:space="preserve">Un recorrido completo, de punta a punta, usando un escenario real de EMEAI:</w:t>
@@ -3920,6 +3948,7 @@
     <w:p>
       <w:pPr>
         <w:spacing w:after="120" w:before="0"/>
+        <w:jc w:val="both"/>
       </w:pPr>
       <w:r>
         <w:t xml:space="preserve">EMEAI informa una filtración de cubierta y adjunta fotografías. (En el archivo real esto ya ocurrió: la "Reparación Cubierta" de 2013, $136.980, a cargo de Barrios Salvador — historia clínica real en el capítulo 9.)</w:t>
@@ -3943,6 +3972,7 @@
     <w:p>
       <w:pPr>
         <w:spacing w:after="120" w:before="0"/>
+        <w:jc w:val="both"/>
       </w:pPr>
       <w:r>
         <w:t xml:space="preserve">SIGEP identifica automáticamente el edificio y crea el pedido.</w:t>
@@ -3966,6 +3996,7 @@
     <w:p>
       <w:pPr>
         <w:spacing w:after="120" w:before="0"/>
+        <w:jc w:val="both"/>
       </w:pPr>
       <w:r>
         <w:t xml:space="preserve">Obras Públicas confirma que corresponde a cubierta/albañilería y evalúa riesgo.</w:t>
@@ -3989,6 +4020,7 @@
     <w:p>
       <w:pPr>
         <w:spacing w:after="120" w:before="0"/>
+        <w:jc w:val="both"/>
       </w:pPr>
       <w:r>
         <w:t xml:space="preserve">El sistema pondera urgencia, afectación del servicio, usuarios, ISE y antigüedad.</w:t>
@@ -4012,6 +4044,7 @@
     <w:p>
       <w:pPr>
         <w:spacing w:after="120" w:before="0"/>
+        <w:jc w:val="both"/>
       </w:pPr>
       <w:r>
         <w:t xml:space="preserve">Se determinan membrana, selladores y otros insumos; primero se consulta depósito/BAMUR y luego proveedores.</w:t>
@@ -4035,6 +4068,7 @@
     <w:p>
       <w:pPr>
         <w:spacing w:after="120" w:before="0"/>
+        <w:jc w:val="both"/>
       </w:pPr>
       <w:r>
         <w:t xml:space="preserve">Se comparan precios y disponibilidad; la opción seleccionada continúa por el circuito de autorización municipal.</w:t>
@@ -4058,6 +4092,7 @@
     <w:p>
       <w:pPr>
         <w:spacing w:after="120" w:before="0"/>
+        <w:jc w:val="both"/>
       </w:pPr>
       <w:r>
         <w:t xml:space="preserve">La OT se asigna a una cuadrilla y fecha en la que materiales y personal estarán disponibles.</w:t>
@@ -4081,6 +4116,7 @@
     <w:p>
       <w:pPr>
         <w:spacing w:after="120" w:before="0"/>
+        <w:jc w:val="both"/>
       </w:pPr>
       <w:r>
         <w:t xml:space="preserve">La cuadrilla recibe en el celular tarea, ubicación, fotos, materiales y observaciones.</w:t>
@@ -4104,6 +4140,7 @@
     <w:p>
       <w:pPr>
         <w:spacing w:after="120" w:before="0"/>
+        <w:jc w:val="both"/>
       </w:pPr>
       <w:r>
         <w:t xml:space="preserve">Se registran horas, materiales reales y fotografías antes/después.</w:t>
@@ -4127,6 +4164,7 @@
     <w:p>
       <w:pPr>
         <w:spacing w:after="120" w:before="0"/>
+        <w:jc w:val="both"/>
       </w:pPr>
       <w:r>
         <w:t xml:space="preserve">La intervención se incorpora a la Historia Clínica Edilicia y alimenta costos, estadísticas y mantenimiento futuro.</w:t>
@@ -4163,6 +4201,7 @@
     <w:p>
       <w:pPr>
         <w:spacing w:after="160" w:before="0"/>
+        <w:jc w:val="both"/>
       </w:pPr>
       <w:r>
         <w:t xml:space="preserve">Menos pedidos perdidos o sin seguimiento. Prioridades técnicamente justificables. Mejor aprovechamiento de las cuatro cuadrillas. Menos viajes innecesarios para retirar o consultar materiales. Compras con información previa y comparación trazable. Costos históricos por edificio y tipo de intervención. En síntesis: pasar de resolver reclamos aislados a gestionar Obras Públicas de manera planificada, eficiente y trazable.</w:t>
@@ -4185,6 +4224,7 @@
     <w:p>
       <w:pPr>
         <w:spacing w:after="160" w:before="0"/>
+        <w:jc w:val="both"/>
       </w:pPr>
       <w:r>
         <w:rPr>
@@ -4466,6 +4506,7 @@
     <w:p>
       <w:pPr>
         <w:spacing w:after="160" w:before="0"/>
+        <w:jc w:val="both"/>
       </w:pPr>
       <w:r>
         <w:t xml:space="preserve">Cada edificio tiene sus propias inspecciones y alertas dentro del sistema.</w:t>
@@ -4483,6 +4524,7 @@
     <w:p>
       <w:pPr>
         <w:spacing w:after="160" w:before="0"/>
+        <w:jc w:val="both"/>
       </w:pPr>
       <w:r>
         <w:t xml:space="preserve">Se releva cada cubierta del parque edilicio y se clasifica en una de cuatro bandas, programando acciones antes de los períodos críticos: Correcta · Observar · Intervenir · Urgente.</w:t>
@@ -4500,6 +4542,7 @@
     <w:p>
       <w:pPr>
         <w:spacing w:after="160" w:before="0"/>
+        <w:jc w:val="both"/>
       </w:pPr>
       <w:r>
         <w:t xml:space="preserve">La cartografía de base es real: la Planta Urbana aportada por el Municipio, no un dibujo inventado. Incluye las manzanas y barrios que la componen (Santa Teresita, El Embarcadero, La Terminal, El Tropezón, El Progreso, Martín Fierro, Padre Gallo, 25 de Mayo, La Perla, El Estadio, Jardín, La Feria, Villa Aurora, Bellas Artes, FONAVI 1 y 2, entre otros), con el Hospital y Obras Públicas ya identificados sobre el propio plano oficial.</w:t>
@@ -4508,6 +4551,7 @@
     <w:p>
       <w:pPr>
         <w:spacing w:after="160" w:before="0"/>
+        <w:jc w:val="both"/>
       </w:pPr>
       <w:r>
         <w:t xml:space="preserve">Sobre esta base, el mapa SIGEP 360 permitirá filtrar los edificios por función y, en una segunda capa, por estado técnico (ISE), prioridad, OT abiertas, alertas e intervenciones — una cartografía viva que se actualiza junto con el inventario, no un dibujo estático. Cada edificio tiene además su propio código QR (Código de Respuesta Rápida): al escanearlo, según el rol del usuario, se puede consultar información, generar una solicitud, ver las OT, registrar una inspección o actualizar trabajos.</w:t>
@@ -4525,6 +4569,7 @@
     <w:p>
       <w:pPr>
         <w:spacing w:after="160" w:before="0"/>
+        <w:jc w:val="both"/>
       </w:pPr>
       <w:r>
         <w:t xml:space="preserve">Cada edificio incorpora progresivamente un Pasaporte Energético y Ambiental: electricidad, gas, agua, superficie, costo anual y consumo específico por m². Las medidas se priorizan por relación costo-beneficio y factibilidad: LED, reducción de pérdidas, mejoras de envolvente, protecciones solares, aislaciones, automatización, solar térmica, fotovoltaica y, donde un estudio de viabilidad lo justifique, bombas de calor o geotermia. Se suman acciones de bajo costo y alto valor ambiental: captación de agua de lluvia, compostaje, reducción de residuos, forestación estratégica y especies nativas — y, en dependencias con espacio adecuado, pequeños sectores de aromáticas (romero, burrito, lavanda) de uso responsable y bajo mantenimiento (Edificios Vivos).</w:t>
@@ -4547,6 +4592,7 @@
     <w:p>
       <w:pPr>
         <w:spacing w:after="160" w:before="0"/>
+        <w:jc w:val="both"/>
       </w:pPr>
       <w:r>
         <w:t xml:space="preserve">La fase 2031–2033 (energías renovables, eficiencia energética) no tiene por qué salir solo de rentas generales: existen líneas provinciales y nacionales de eficiencia energética y energía renovable municipal a las que Ayacucho puede postularse. Incluir esa gestión de financiamiento como tarea explícita de la Jefatura, no como una esperanza tácita.</w:t>
@@ -4569,6 +4615,7 @@
     <w:p>
       <w:pPr>
         <w:spacing w:after="160" w:before="0"/>
+        <w:jc w:val="both"/>
       </w:pPr>
       <w:r>
         <w:rPr>
@@ -4591,6 +4638,7 @@
     <w:p>
       <w:pPr>
         <w:spacing w:after="160" w:before="0"/>
+        <w:jc w:val="both"/>
       </w:pPr>
       <w:r>
         <w:t xml:space="preserve">La tecnología debe reducir improvisación y tareas administrativas innecesarias. Se propone un Programa de Reconocimiento por Objetivos de Equipo —sujeto a normativa laboral, disponibilidad presupuestaria y autorización competente— que puede considerar plazo, calidad, seguridad, orden, uso responsable de materiales, documentación y ausencia de retrabajos. Los reconocimientos podrán combinar incentivos económicos cuando legalmente sean posibles con capacitación, certificaciones y reconocimiento institucional; el enfoque es colectivo, para evitar competencia improductiva.</w:t>
@@ -4608,6 +4656,7 @@
     <w:p>
       <w:pPr>
         <w:spacing w:after="160" w:before="0"/>
+        <w:jc w:val="both"/>
       </w:pPr>
       <w:r>
         <w:t xml:space="preserve">Las intervenciones que afecten estructura, accesibilidad, instalaciones, seguridad, patrimonio o funcionamiento cuentan con evaluación técnica previa de Obras Públicas. Los responsables de cada dependencia conservan la capacidad de plantear necesidades, pero la solución edilicia se integra a criterios técnicos y al historial del edificio (el caso de la Biblioteca, capítulo 1, es exactamente lo que este principio busca evitar). La información, los planos, los diagnósticos y las decisiones técnicas permanecen como patrimonio del Municipio más allá de quién ocupe temporalmente cada función — pero "la información pertenece al Municipio, no a una gestión" es una frase que necesita un instrumento concreto detrás:</w:t>
@@ -4630,6 +4679,7 @@
     <w:p>
       <w:pPr>
         <w:spacing w:after="160" w:before="0"/>
+        <w:jc w:val="both"/>
       </w:pPr>
       <w:r>
         <w:t xml:space="preserve">Proyecto de ordenanza breve que declare a SIGEP 360 sistema de gestión patrimonial obligatorio de la Jefatura de Obras Públicas, establezca que los datos cargados son propiedad municipal (no de un proveedor ni de una gestión) y fije una continuidad presupuestaria mínima para su operación. Es la única garantía real, más allá del discurso, de que el sistema sobrevive a un cambio de gobierno.</w:t>
@@ -5064,6 +5114,7 @@
     <w:p>
       <w:pPr>
         <w:spacing w:after="160" w:before="0"/>
+        <w:jc w:val="both"/>
       </w:pPr>
       <w:r>
         <w:rPr>
@@ -5734,6 +5785,7 @@
     <w:p>
       <w:pPr>
         <w:spacing w:after="160" w:before="0"/>
+        <w:jc w:val="both"/>
       </w:pPr>
       <w:r>
         <w:t xml:space="preserve">El propio archivo histórico de Obras Públicas (2013–2023) lo demuestra: sumar el monto de una reparación de 2013 con el de una de 2023 no da una cifra financieramente significativa, por la inflación acumulada en el período. "Costo de mantenimiento por m²" debe expresarse en una unidad de valor real y no en pesos históricos sumados sin ajustar. Es un detalle técnico, pero evita comparaciones económicas engañosas entre períodos con inflación muy distinta.</w:t>
@@ -5751,6 +5803,7 @@
     <w:p>
       <w:pPr>
         <w:spacing w:after="160" w:before="0"/>
+        <w:jc w:val="both"/>
       </w:pPr>
       <w:r>
         <w:t xml:space="preserve">La IA se incorpora de forma gradual como herramienta de apoyo, nunca como sustituto de la inspección y responsabilidad profesional. Puede ayudar a ordenar fotografías, detectar patrones, comparar antecedentes, sugerir reincidencias y priorizar revisiones. Ejemplo: si un edificio acumula varias reparaciones similares de cubierta en pocos años, el sistema puede advertir la repetición y sugerir evaluar una solución integral en lugar de continuar con parches aislados. Toda recomendación generada por herramientas automáticas debe ser validada por personal técnico antes de transformarse en una decisión de obra.</w:t>
@@ -5773,6 +5826,7 @@
     <w:p>
       <w:pPr>
         <w:spacing w:after="160" w:before="0"/>
+        <w:jc w:val="both"/>
       </w:pPr>
       <w:r>
         <w:t xml:space="preserve">Una versión pública y de solo lectura del Dashboard —ISE por edificio, OT en curso, sin datos sensibles— sobre la misma base de datos, con otra interfaz. Convierte un argumento de transparencia en un entregable concreto, sin desarrollo adicional relevante sobre la arquitectura ya planteada.</w:t>
@@ -5795,6 +5849,7 @@
     <w:p>
       <w:pPr>
         <w:spacing w:after="160" w:before="0"/>
+        <w:jc w:val="both"/>
       </w:pPr>
       <w:r>
         <w:t xml:space="preserve">Según referencias del sector, una intervención preventiva cuesta entre 3 y 5 veces menos que la reparación reactiva de la misma falla agravada. Vale citarlo, con esa prudencia, como argumento económico del cambio de modelo — el "% OT preventivas / total OT" es, en definitiva, un indicador de ahorro.</w:t>
@@ -5817,6 +5872,7 @@
     <w:p>
       <w:pPr>
         <w:spacing w:after="160" w:before="0"/>
+        <w:jc w:val="both"/>
       </w:pPr>
       <w:r>
         <w:rPr>
@@ -5839,6 +5895,7 @@
     <w:p>
       <w:pPr>
         <w:spacing w:after="160" w:before="0"/>
+        <w:jc w:val="both"/>
       </w:pPr>
       <w:r>
         <w:t xml:space="preserve">No se desarrollan aplicaciones independientes. Una única base de datos central, con interfaces distintas según el usuario: Jefe de Obras Públicas (mapa, patrimonio, ISE, prioridades, OT, cuadrillas, materiales, indicadores), Responsable de edificio (solicitud, fotos, seguimiento), Cuadrilla (trabajos del día, ubicación, instrucciones, materiales, cierre), Depósito (stock, reservas, BAMUR), Compras (necesidades, presupuestos, proveedores), Secretaría (autorizaciones, presupuesto, tablero ejecutivo) y, más adelante, Proveedor (actualización limitada de catálogo/precios).</w:t>
@@ -5856,6 +5913,7 @@
     <w:p>
       <w:pPr>
         <w:spacing w:after="160" w:before="0"/>
+        <w:jc w:val="both"/>
       </w:pPr>
       <w:r>
         <w:t xml:space="preserve">El presupuesto de Obras Públicas es organizado y autorizado por la Secretaría — SIGEP 360 no propone una autonomía presupuestaria ajena a la estructura vigente. Propone mejorar la calidad de la información con la que se formula, solicita, autoriza y controla el gasto. La implementación inicial privilegia herramientas de bajo costo: inventario, procedimientos, formularios digitales, cartografía, QR y tableros; las inversiones mayores —sensores, renovables, software específico— se justifican mediante proyectos, ahorro esperado, criticidad y disponibilidad presupuestaria.</w:t>
@@ -5873,6 +5931,7 @@
     <w:p>
       <w:pPr>
         <w:spacing w:after="160" w:before="0"/>
+        <w:jc w:val="both"/>
       </w:pPr>
       <w:r>
         <w:t xml:space="preserve">Pequeño, pero funcionando de verdad. No se intenta construir todo SIGEP 360 al mismo tiempo.</w:t>
@@ -6025,6 +6084,7 @@
     <w:p>
       <w:pPr>
         <w:spacing w:after="160" w:before="0"/>
+        <w:jc w:val="both"/>
       </w:pPr>
       <w:r>
         <w:t xml:space="preserve">Antes de que el MVP esté operativo, un relevamiento acotado (fines de 2026 / inicio de 2027) calcula el ISE inicial de las 71 dependencias. Es barato —una planilla y una recorrida— y resuelve el problema de fondo: hoy no existe una línea de base contra la cual medir, en 2031, si el sistema efectivamente mejoró algo.</w:t>
@@ -6057,6 +6117,7 @@
     <w:p>
       <w:pPr>
         <w:spacing w:after="120" w:before="0"/>
+        <w:jc w:val="both"/>
       </w:pPr>
       <w:r>
         <w:t xml:space="preserve">Inventario dinámico, codificación, mapa, fichas, relevamiento inicial, piloto de cubiertas y Orden de Trabajo. Incluye el sprint de diagnóstico Año 0.</w:t>
@@ -6080,6 +6141,7 @@
     <w:p>
       <w:pPr>
         <w:spacing w:after="120" w:before="0"/>
+        <w:jc w:val="both"/>
       </w:pPr>
       <w:r>
         <w:t xml:space="preserve">ISE, criticidad, protocolos preventivos, QR, planificación sistemática de cuadrillas.</w:t>
@@ -6103,6 +6165,7 @@
     <w:p>
       <w:pPr>
         <w:spacing w:after="120" w:before="0"/>
+        <w:jc w:val="both"/>
       </w:pPr>
       <w:r>
         <w:t xml:space="preserve">Pasaporte energético, indicadores, BAMUR, consumos y primeros proyectos de eficiencia.</w:t>
@@ -6126,6 +6189,7 @@
     <w:p>
       <w:pPr>
         <w:spacing w:after="120" w:before="0"/>
+        <w:jc w:val="both"/>
       </w:pPr>
       <w:r>
         <w:t xml:space="preserve">Tablero avanzado, sensores donde aporten valor, automatización, proyectos ambientales y energéticos piloto, con financiamiento externo gestionado.</w:t>
@@ -6149,6 +6213,7 @@
     <w:p>
       <w:pPr>
         <w:spacing w:after="120" w:before="0"/>
+        <w:jc w:val="both"/>
       </w:pPr>
       <w:r>
         <w:t xml:space="preserve">Analítica histórica, asistencia con IA, mantenimiento predictivo y consolidación del Plan Director.</w:t>
@@ -6171,6 +6236,7 @@
     <w:p>
       <w:pPr>
         <w:spacing w:after="160" w:before="0"/>
+        <w:jc w:val="both"/>
       </w:pPr>
       <w:r>
         <w:rPr>
@@ -6184,6 +6250,7 @@
     <w:p>
       <w:pPr>
         <w:spacing w:after="160" w:before="0"/>
+        <w:jc w:val="both"/>
       </w:pPr>
       <w:r>
         <w:t xml:space="preserve">El Municipio ya produjo, durante más de una década, planos, fotografías y conocimiento técnico sobre EMEAI: relevamiento fotográfico desde 2013, plano de obra existente actualizado a 2026, y el registro de 25 intervenciones reales en el archivo de compras de Obras Públicas. El problema nunca fue la falta de información — fue que esa información vive dispersa en carpetas, discos y memorias individuales. SIGEP 360 convierte años de trabajo en memoria institucional, y la vuelve información para decidir qué hacer mañana.</w:t>
@@ -6451,6 +6518,7 @@
     <w:p>
       <w:pPr>
         <w:spacing w:after="160" w:before="0"/>
+        <w:jc w:val="both"/>
       </w:pPr>
       <w:r>
         <w:t xml:space="preserve">El plano de obra existente identifica aulas, Dirección, Preceptoría, Secretaría, depósitos, aula de percusión, estudio de grabación, Sala de Presentaciones, sanitarios, patios y salidas de emergencia — la base exacta sobre la que se construyó el plano interactivo del piloto: tocar un sector del plano y ver su historia real, incluidos los sectores que no tienen intervenciones registradas, que son tan reveladores como los que sí.</w:t>
@@ -6468,6 +6536,7 @@
     <w:p>
       <w:pPr>
         <w:spacing w:after="160" w:before="0"/>
+        <w:jc w:val="both"/>
       </w:pPr>
       <w:r>
         <w:t xml:space="preserve">Plano clickeable, línea de tiempo fotográfica 2013–2026, historia clínica real, ISE de ejemplo, caso BAMUR, trayectoria institucional y cálculo de energía sustentable (SIGEP Verde):</w:t>
@@ -6502,6 +6571,7 @@
     <w:p>
       <w:pPr>
         <w:spacing w:after="160" w:before="0"/>
+        <w:jc w:val="both"/>
       </w:pPr>
       <w:r>
         <w:rPr>
@@ -6524,6 +6594,7 @@
     <w:p>
       <w:pPr>
         <w:spacing w:after="160" w:before="0"/>
+        <w:jc w:val="both"/>
       </w:pPr>
       <w:r>
         <w:t xml:space="preserve">Código SIGEP · Dependencia · Función · Dirección / ubicación · Nomenclatura / partida · Superficie · Responsable de uso · Año / antigüedad estimada · Sistema constructivo · Estructura · Cubierta · Instalación eléctrica · Instalación sanitaria · Gas / climatización · Accesibilidad · Seguridad · ISE · Criticidad funcional · Última inspección · Próxima inspección · OT abiertas · Consumos · Fotografías / planos</w:t>
@@ -6541,6 +6612,7 @@
     <w:p>
       <w:pPr>
         <w:spacing w:after="160" w:before="0"/>
+        <w:jc w:val="both"/>
       </w:pPr>
       <w:r>
         <w:t xml:space="preserve">N.° OT · Fecha y hora de ingreso · Dependencia · Solicitante / canal · Descripción · Fotografías · Especialidad · Prioridad · Evaluación técnica · Autorización · Cuadrilla asignada · Fecha programada · Horario conveniente · Materiales previstos · Trabajo ejecutado · Horas utilizadas · Materiales utilizados · Control final · Fotos antes/después · Próxima acción · Fecha de cierre</w:t>
@@ -6558,6 +6630,7 @@
     <w:p>
       <w:pPr>
         <w:spacing w:after="160" w:before="0"/>
+        <w:jc w:val="both"/>
       </w:pPr>
       <w:r>
         <w:t xml:space="preserve">Inventario de dependencias municipales aportado para el proyecto (base inicial de 71 dependencias, sujeto a actualización). Planta Urbana 2024 de Ayacucho, aportada como base cartográfica (capítulo 5). Documento "Pautas y recomendaciones generales para establecer un programa de trabajos y mantenimiento..." aportado como antecedente conceptual. Información operativa suministrada por la Jefatura: estructura de cuadrillas, horario, circuito de pedidos, presupuesto, depósito, equipamiento, patologías recurrentes y criterios de gestión. A esto se suma, para el caso piloto EMEAI (capítulo 9): el plano de obra existente, el archivo fotográfico municipal 2013–2023 y el registro real de órdenes de compra de Obras Públicas.</w:t>
@@ -6566,6 +6639,7 @@
     <w:p>
       <w:pPr>
         <w:spacing w:after="160" w:before="0"/>
+        <w:jc w:val="both"/>
       </w:pPr>
       <w:r>
         <w:rPr>
@@ -6595,6 +6669,7 @@
     <w:p>
       <w:pPr>
         <w:spacing w:after="160" w:before="0"/>
+        <w:jc w:val="both"/>
       </w:pPr>
       <w:r>
         <w:t xml:space="preserve">SIGEP 360 busca que Obras Públicas deje de ser, exclusivamente, el área que responde cuando algo se rompe. Debe convertirse en el área municipal que conoce, diagnostica, prioriza, planifica, presupuesta, programa, ejecuta, controla, documenta, mide, aprende y anticipa.</w:t>
@@ -6603,6 +6678,7 @@
     <w:p>
       <w:pPr>
         <w:spacing w:after="160" w:before="0"/>
+        <w:jc w:val="both"/>
       </w:pPr>
       <w:r>
         <w:t xml:space="preserve">El objetivo no es digitalizar el desorden. Es rediseñar primero el sistema de trabajo, y usar la tecnología para hacerlo posible. Técnicamente sólido. Económicamente realizable. Escalable. Fácil de usar. Sostenible en el tiempo. Independiente de los cambios de gestión. Replicable por otras áreas municipales y otros municipios.</w:t>

</xml_diff>